<commit_message>
Add phishing URL prediction pipeline and FastAPI backend
</commit_message>
<xml_diff>
--- a/documentation.docx
+++ b/documentation.docx
@@ -828,10 +828,7 @@
         <w:pStyle w:val="Heading1"/>
       </w:pPr>
       <w:r>
-        <w:t>F</w:t>
-      </w:r>
-      <w:r>
-        <w:t>eatures you can extract from URLs</w:t>
+        <w:t>Features you can extract from URLs</w:t>
       </w:r>
     </w:p>
     <w:p>
@@ -10738,7 +10735,7 @@
     <w:p>
       <w:r>
         <w:pict w14:anchorId="1F4B0699">
-          <v:rect id="_x0000_i1053" style="width:0;height:1.5pt" o:hralign="center" o:hrstd="t" o:hr="t" fillcolor="#a0a0a0" stroked="f"/>
+          <v:rect id="_x0000_i1039" style="width:0;height:1.5pt" o:hralign="center" o:hrstd="t" o:hr="t" fillcolor="#a0a0a0" stroked="f"/>
         </w:pict>
       </w:r>
     </w:p>
@@ -10821,7 +10818,1131 @@
         <w:t>1                    → Legitimate</w:t>
       </w:r>
     </w:p>
-    <w:p>
+    <w:tbl>
+      <w:tblPr>
+        <w:tblW w:w="0" w:type="auto"/>
+        <w:tblCellSpacing w:w="15" w:type="dxa"/>
+        <w:tblCellMar>
+          <w:top w:w="15" w:type="dxa"/>
+          <w:left w:w="15" w:type="dxa"/>
+          <w:bottom w:w="15" w:type="dxa"/>
+          <w:right w:w="15" w:type="dxa"/>
+        </w:tblCellMar>
+        <w:tblLook w:val="04A0" w:firstRow="1" w:lastRow="0" w:firstColumn="1" w:lastColumn="0" w:noHBand="0" w:noVBand="1"/>
+      </w:tblPr>
+      <w:tblGrid>
+        <w:gridCol w:w="2596"/>
+        <w:gridCol w:w="2327"/>
+        <w:gridCol w:w="1675"/>
+      </w:tblGrid>
+      <w:tr>
+        <w:trPr>
+          <w:tblHeader/>
+          <w:tblCellSpacing w:w="15" w:type="dxa"/>
+        </w:trPr>
+        <w:tc>
+          <w:tcPr>
+            <w:tcW w:w="0" w:type="auto"/>
+            <w:vAlign w:val="center"/>
+            <w:hideMark/>
+          </w:tcPr>
+          <w:p>
+            <w:pPr>
+              <w:spacing w:after="0" w:line="240" w:lineRule="auto"/>
+              <w:jc w:val="center"/>
+              <w:rPr>
+                <w:rFonts w:ascii="Times New Roman" w:eastAsia="Times New Roman" w:hAnsi="Times New Roman" w:cs="Times New Roman"/>
+                <w:b/>
+                <w:bCs/>
+                <w:sz w:val="24"/>
+                <w:szCs w:val="24"/>
+                <w:lang w:eastAsia="en-GB"/>
+              </w:rPr>
+            </w:pPr>
+            <w:r>
+              <w:rPr>
+                <w:rFonts w:ascii="Times New Roman" w:eastAsia="Times New Roman" w:hAnsi="Times New Roman" w:cs="Times New Roman"/>
+                <w:b/>
+                <w:bCs/>
+                <w:sz w:val="24"/>
+                <w:szCs w:val="24"/>
+                <w:lang w:eastAsia="en-GB"/>
+              </w:rPr>
+              <w:t>Feature</w:t>
+            </w:r>
+          </w:p>
+        </w:tc>
+        <w:tc>
+          <w:tcPr>
+            <w:tcW w:w="0" w:type="auto"/>
+            <w:vAlign w:val="center"/>
+            <w:hideMark/>
+          </w:tcPr>
+          <w:p>
+            <w:pPr>
+              <w:spacing w:after="0" w:line="240" w:lineRule="auto"/>
+              <w:jc w:val="right"/>
+              <w:rPr>
+                <w:rFonts w:ascii="Times New Roman" w:eastAsia="Times New Roman" w:hAnsi="Times New Roman" w:cs="Times New Roman"/>
+                <w:b/>
+                <w:bCs/>
+                <w:sz w:val="24"/>
+                <w:szCs w:val="24"/>
+                <w:lang w:eastAsia="en-GB"/>
+              </w:rPr>
+            </w:pPr>
+            <w:r>
+              <w:rPr>
+                <w:rFonts w:ascii="Times New Roman" w:eastAsia="Times New Roman" w:hAnsi="Times New Roman" w:cs="Times New Roman"/>
+                <w:b/>
+                <w:bCs/>
+                <w:sz w:val="24"/>
+                <w:szCs w:val="24"/>
+                <w:lang w:eastAsia="en-GB"/>
+              </w:rPr>
+              <w:t>Correlation with label</w:t>
+            </w:r>
+          </w:p>
+        </w:tc>
+        <w:tc>
+          <w:tcPr>
+            <w:tcW w:w="0" w:type="auto"/>
+            <w:vAlign w:val="center"/>
+            <w:hideMark/>
+          </w:tcPr>
+          <w:p>
+            <w:pPr>
+              <w:spacing w:after="0" w:line="240" w:lineRule="auto"/>
+              <w:jc w:val="center"/>
+              <w:rPr>
+                <w:rFonts w:ascii="Times New Roman" w:eastAsia="Times New Roman" w:hAnsi="Times New Roman" w:cs="Times New Roman"/>
+                <w:b/>
+                <w:bCs/>
+                <w:sz w:val="24"/>
+                <w:szCs w:val="24"/>
+                <w:lang w:eastAsia="en-GB"/>
+              </w:rPr>
+            </w:pPr>
+            <w:r>
+              <w:rPr>
+                <w:rFonts w:ascii="Times New Roman" w:eastAsia="Times New Roman" w:hAnsi="Times New Roman" w:cs="Times New Roman"/>
+                <w:b/>
+                <w:bCs/>
+                <w:sz w:val="24"/>
+                <w:szCs w:val="24"/>
+                <w:lang w:eastAsia="en-GB"/>
+              </w:rPr>
+              <w:t>Interpretation</w:t>
+            </w:r>
+          </w:p>
+        </w:tc>
+      </w:tr>
+      <w:tr>
+        <w:trPr>
+          <w:tblCellSpacing w:w="15" w:type="dxa"/>
+        </w:trPr>
+        <w:tc>
+          <w:tcPr>
+            <w:tcW w:w="0" w:type="auto"/>
+            <w:vAlign w:val="center"/>
+            <w:hideMark/>
+          </w:tcPr>
+          <w:p>
+            <w:pPr>
+              <w:spacing w:after="0" w:line="240" w:lineRule="auto"/>
+              <w:rPr>
+                <w:rFonts w:ascii="Times New Roman" w:eastAsia="Times New Roman" w:hAnsi="Times New Roman" w:cs="Times New Roman"/>
+                <w:sz w:val="24"/>
+                <w:szCs w:val="24"/>
+                <w:lang w:eastAsia="en-GB"/>
+              </w:rPr>
+            </w:pPr>
+            <w:proofErr w:type="spellStart"/>
+            <w:r>
+              <w:rPr>
+                <w:rFonts w:ascii="Courier New" w:eastAsia="Times New Roman" w:hAnsi="Courier New" w:cs="Courier New"/>
+                <w:sz w:val="20"/>
+                <w:szCs w:val="20"/>
+                <w:lang w:eastAsia="en-GB"/>
+              </w:rPr>
+              <w:t>URLSimilarityIndex</w:t>
+            </w:r>
+            <w:proofErr w:type="spellEnd"/>
+          </w:p>
+        </w:tc>
+        <w:tc>
+          <w:tcPr>
+            <w:tcW w:w="0" w:type="auto"/>
+            <w:vAlign w:val="center"/>
+            <w:hideMark/>
+          </w:tcPr>
+          <w:p>
+            <w:pPr>
+              <w:spacing w:after="0" w:line="240" w:lineRule="auto"/>
+              <w:jc w:val="right"/>
+              <w:rPr>
+                <w:rFonts w:ascii="Times New Roman" w:eastAsia="Times New Roman" w:hAnsi="Times New Roman" w:cs="Times New Roman"/>
+                <w:sz w:val="24"/>
+                <w:szCs w:val="24"/>
+                <w:lang w:eastAsia="en-GB"/>
+              </w:rPr>
+            </w:pPr>
+            <w:r>
+              <w:rPr>
+                <w:rFonts w:ascii="Times New Roman" w:eastAsia="Times New Roman" w:hAnsi="Times New Roman" w:cs="Times New Roman"/>
+                <w:b/>
+                <w:bCs/>
+                <w:sz w:val="24"/>
+                <w:szCs w:val="24"/>
+                <w:lang w:eastAsia="en-GB"/>
+              </w:rPr>
+              <w:t>+0.86</w:t>
+            </w:r>
+          </w:p>
+        </w:tc>
+        <w:tc>
+          <w:tcPr>
+            <w:tcW w:w="0" w:type="auto"/>
+            <w:vAlign w:val="center"/>
+            <w:hideMark/>
+          </w:tcPr>
+          <w:p>
+            <w:pPr>
+              <w:spacing w:after="0" w:line="240" w:lineRule="auto"/>
+              <w:rPr>
+                <w:rFonts w:ascii="Times New Roman" w:eastAsia="Times New Roman" w:hAnsi="Times New Roman" w:cs="Times New Roman"/>
+                <w:sz w:val="24"/>
+                <w:szCs w:val="24"/>
+                <w:lang w:eastAsia="en-GB"/>
+              </w:rPr>
+            </w:pPr>
+            <w:r>
+              <w:rPr>
+                <w:rFonts w:ascii="Times New Roman" w:eastAsia="Times New Roman" w:hAnsi="Times New Roman" w:cs="Times New Roman"/>
+                <w:sz w:val="24"/>
+                <w:szCs w:val="24"/>
+                <w:lang w:eastAsia="en-GB"/>
+              </w:rPr>
+              <w:t>Very strong</w:t>
+            </w:r>
+          </w:p>
+        </w:tc>
+      </w:tr>
+      <w:tr>
+        <w:trPr>
+          <w:tblCellSpacing w:w="15" w:type="dxa"/>
+        </w:trPr>
+        <w:tc>
+          <w:tcPr>
+            <w:tcW w:w="0" w:type="auto"/>
+            <w:vAlign w:val="center"/>
+            <w:hideMark/>
+          </w:tcPr>
+          <w:p>
+            <w:pPr>
+              <w:spacing w:after="0" w:line="240" w:lineRule="auto"/>
+              <w:rPr>
+                <w:rFonts w:ascii="Times New Roman" w:eastAsia="Times New Roman" w:hAnsi="Times New Roman" w:cs="Times New Roman"/>
+                <w:sz w:val="24"/>
+                <w:szCs w:val="24"/>
+                <w:lang w:eastAsia="en-GB"/>
+              </w:rPr>
+            </w:pPr>
+            <w:proofErr w:type="spellStart"/>
+            <w:r>
+              <w:rPr>
+                <w:rFonts w:ascii="Courier New" w:eastAsia="Times New Roman" w:hAnsi="Courier New" w:cs="Courier New"/>
+                <w:sz w:val="20"/>
+                <w:szCs w:val="20"/>
+                <w:lang w:eastAsia="en-GB"/>
+              </w:rPr>
+              <w:t>HasSocialNet</w:t>
+            </w:r>
+            <w:proofErr w:type="spellEnd"/>
+          </w:p>
+        </w:tc>
+        <w:tc>
+          <w:tcPr>
+            <w:tcW w:w="0" w:type="auto"/>
+            <w:vAlign w:val="center"/>
+            <w:hideMark/>
+          </w:tcPr>
+          <w:p>
+            <w:pPr>
+              <w:spacing w:after="0" w:line="240" w:lineRule="auto"/>
+              <w:jc w:val="right"/>
+              <w:rPr>
+                <w:rFonts w:ascii="Times New Roman" w:eastAsia="Times New Roman" w:hAnsi="Times New Roman" w:cs="Times New Roman"/>
+                <w:sz w:val="24"/>
+                <w:szCs w:val="24"/>
+                <w:lang w:eastAsia="en-GB"/>
+              </w:rPr>
+            </w:pPr>
+            <w:r>
+              <w:rPr>
+                <w:rFonts w:ascii="Times New Roman" w:eastAsia="Times New Roman" w:hAnsi="Times New Roman" w:cs="Times New Roman"/>
+                <w:b/>
+                <w:bCs/>
+                <w:sz w:val="24"/>
+                <w:szCs w:val="24"/>
+                <w:lang w:eastAsia="en-GB"/>
+              </w:rPr>
+              <w:t>+0.78</w:t>
+            </w:r>
+          </w:p>
+        </w:tc>
+        <w:tc>
+          <w:tcPr>
+            <w:tcW w:w="0" w:type="auto"/>
+            <w:vAlign w:val="center"/>
+            <w:hideMark/>
+          </w:tcPr>
+          <w:p>
+            <w:pPr>
+              <w:spacing w:after="0" w:line="240" w:lineRule="auto"/>
+              <w:rPr>
+                <w:rFonts w:ascii="Times New Roman" w:eastAsia="Times New Roman" w:hAnsi="Times New Roman" w:cs="Times New Roman"/>
+                <w:sz w:val="24"/>
+                <w:szCs w:val="24"/>
+                <w:lang w:eastAsia="en-GB"/>
+              </w:rPr>
+            </w:pPr>
+            <w:r>
+              <w:rPr>
+                <w:rFonts w:ascii="Times New Roman" w:eastAsia="Times New Roman" w:hAnsi="Times New Roman" w:cs="Times New Roman"/>
+                <w:sz w:val="24"/>
+                <w:szCs w:val="24"/>
+                <w:lang w:eastAsia="en-GB"/>
+              </w:rPr>
+              <w:t>Strong</w:t>
+            </w:r>
+          </w:p>
+        </w:tc>
+      </w:tr>
+      <w:tr>
+        <w:trPr>
+          <w:tblCellSpacing w:w="15" w:type="dxa"/>
+        </w:trPr>
+        <w:tc>
+          <w:tcPr>
+            <w:tcW w:w="0" w:type="auto"/>
+            <w:vAlign w:val="center"/>
+            <w:hideMark/>
+          </w:tcPr>
+          <w:p>
+            <w:pPr>
+              <w:spacing w:after="0" w:line="240" w:lineRule="auto"/>
+              <w:rPr>
+                <w:rFonts w:ascii="Times New Roman" w:eastAsia="Times New Roman" w:hAnsi="Times New Roman" w:cs="Times New Roman"/>
+                <w:sz w:val="24"/>
+                <w:szCs w:val="24"/>
+                <w:lang w:eastAsia="en-GB"/>
+              </w:rPr>
+            </w:pPr>
+            <w:proofErr w:type="spellStart"/>
+            <w:r>
+              <w:rPr>
+                <w:rFonts w:ascii="Courier New" w:eastAsia="Times New Roman" w:hAnsi="Courier New" w:cs="Courier New"/>
+                <w:sz w:val="20"/>
+                <w:szCs w:val="20"/>
+                <w:lang w:eastAsia="en-GB"/>
+              </w:rPr>
+              <w:t>HasCopyrightInfo</w:t>
+            </w:r>
+            <w:proofErr w:type="spellEnd"/>
+          </w:p>
+        </w:tc>
+        <w:tc>
+          <w:tcPr>
+            <w:tcW w:w="0" w:type="auto"/>
+            <w:vAlign w:val="center"/>
+            <w:hideMark/>
+          </w:tcPr>
+          <w:p>
+            <w:pPr>
+              <w:spacing w:after="0" w:line="240" w:lineRule="auto"/>
+              <w:jc w:val="right"/>
+              <w:rPr>
+                <w:rFonts w:ascii="Times New Roman" w:eastAsia="Times New Roman" w:hAnsi="Times New Roman" w:cs="Times New Roman"/>
+                <w:sz w:val="24"/>
+                <w:szCs w:val="24"/>
+                <w:lang w:eastAsia="en-GB"/>
+              </w:rPr>
+            </w:pPr>
+            <w:r>
+              <w:rPr>
+                <w:rFonts w:ascii="Times New Roman" w:eastAsia="Times New Roman" w:hAnsi="Times New Roman" w:cs="Times New Roman"/>
+                <w:b/>
+                <w:bCs/>
+                <w:sz w:val="24"/>
+                <w:szCs w:val="24"/>
+                <w:lang w:eastAsia="en-GB"/>
+              </w:rPr>
+              <w:t>+0.74</w:t>
+            </w:r>
+          </w:p>
+        </w:tc>
+        <w:tc>
+          <w:tcPr>
+            <w:tcW w:w="0" w:type="auto"/>
+            <w:vAlign w:val="center"/>
+            <w:hideMark/>
+          </w:tcPr>
+          <w:p>
+            <w:pPr>
+              <w:spacing w:after="0" w:line="240" w:lineRule="auto"/>
+              <w:rPr>
+                <w:rFonts w:ascii="Times New Roman" w:eastAsia="Times New Roman" w:hAnsi="Times New Roman" w:cs="Times New Roman"/>
+                <w:sz w:val="24"/>
+                <w:szCs w:val="24"/>
+                <w:lang w:eastAsia="en-GB"/>
+              </w:rPr>
+            </w:pPr>
+            <w:r>
+              <w:rPr>
+                <w:rFonts w:ascii="Times New Roman" w:eastAsia="Times New Roman" w:hAnsi="Times New Roman" w:cs="Times New Roman"/>
+                <w:sz w:val="24"/>
+                <w:szCs w:val="24"/>
+                <w:lang w:eastAsia="en-GB"/>
+              </w:rPr>
+              <w:t>Strong</w:t>
+            </w:r>
+          </w:p>
+        </w:tc>
+      </w:tr>
+      <w:tr>
+        <w:trPr>
+          <w:tblCellSpacing w:w="15" w:type="dxa"/>
+        </w:trPr>
+        <w:tc>
+          <w:tcPr>
+            <w:tcW w:w="0" w:type="auto"/>
+            <w:vAlign w:val="center"/>
+            <w:hideMark/>
+          </w:tcPr>
+          <w:p>
+            <w:pPr>
+              <w:spacing w:after="0" w:line="240" w:lineRule="auto"/>
+              <w:rPr>
+                <w:rFonts w:ascii="Times New Roman" w:eastAsia="Times New Roman" w:hAnsi="Times New Roman" w:cs="Times New Roman"/>
+                <w:sz w:val="24"/>
+                <w:szCs w:val="24"/>
+                <w:lang w:eastAsia="en-GB"/>
+              </w:rPr>
+            </w:pPr>
+            <w:proofErr w:type="spellStart"/>
+            <w:r>
+              <w:rPr>
+                <w:rFonts w:ascii="Courier New" w:eastAsia="Times New Roman" w:hAnsi="Courier New" w:cs="Courier New"/>
+                <w:sz w:val="20"/>
+                <w:szCs w:val="20"/>
+                <w:lang w:eastAsia="en-GB"/>
+              </w:rPr>
+              <w:t>HasDescription</w:t>
+            </w:r>
+            <w:proofErr w:type="spellEnd"/>
+          </w:p>
+        </w:tc>
+        <w:tc>
+          <w:tcPr>
+            <w:tcW w:w="0" w:type="auto"/>
+            <w:vAlign w:val="center"/>
+            <w:hideMark/>
+          </w:tcPr>
+          <w:p>
+            <w:pPr>
+              <w:spacing w:after="0" w:line="240" w:lineRule="auto"/>
+              <w:jc w:val="right"/>
+              <w:rPr>
+                <w:rFonts w:ascii="Times New Roman" w:eastAsia="Times New Roman" w:hAnsi="Times New Roman" w:cs="Times New Roman"/>
+                <w:sz w:val="24"/>
+                <w:szCs w:val="24"/>
+                <w:lang w:eastAsia="en-GB"/>
+              </w:rPr>
+            </w:pPr>
+            <w:r>
+              <w:rPr>
+                <w:rFonts w:ascii="Times New Roman" w:eastAsia="Times New Roman" w:hAnsi="Times New Roman" w:cs="Times New Roman"/>
+                <w:b/>
+                <w:bCs/>
+                <w:sz w:val="24"/>
+                <w:szCs w:val="24"/>
+                <w:lang w:eastAsia="en-GB"/>
+              </w:rPr>
+              <w:t>+0.69</w:t>
+            </w:r>
+          </w:p>
+        </w:tc>
+        <w:tc>
+          <w:tcPr>
+            <w:tcW w:w="0" w:type="auto"/>
+            <w:vAlign w:val="center"/>
+            <w:hideMark/>
+          </w:tcPr>
+          <w:p>
+            <w:pPr>
+              <w:spacing w:after="0" w:line="240" w:lineRule="auto"/>
+              <w:rPr>
+                <w:rFonts w:ascii="Times New Roman" w:eastAsia="Times New Roman" w:hAnsi="Times New Roman" w:cs="Times New Roman"/>
+                <w:sz w:val="24"/>
+                <w:szCs w:val="24"/>
+                <w:lang w:eastAsia="en-GB"/>
+              </w:rPr>
+            </w:pPr>
+            <w:r>
+              <w:rPr>
+                <w:rFonts w:ascii="Times New Roman" w:eastAsia="Times New Roman" w:hAnsi="Times New Roman" w:cs="Times New Roman"/>
+                <w:sz w:val="24"/>
+                <w:szCs w:val="24"/>
+                <w:lang w:eastAsia="en-GB"/>
+              </w:rPr>
+              <w:t>Strong</w:t>
+            </w:r>
+          </w:p>
+        </w:tc>
+      </w:tr>
+      <w:tr>
+        <w:trPr>
+          <w:tblCellSpacing w:w="15" w:type="dxa"/>
+        </w:trPr>
+        <w:tc>
+          <w:tcPr>
+            <w:tcW w:w="0" w:type="auto"/>
+            <w:vAlign w:val="center"/>
+            <w:hideMark/>
+          </w:tcPr>
+          <w:p>
+            <w:pPr>
+              <w:spacing w:after="0" w:line="240" w:lineRule="auto"/>
+              <w:rPr>
+                <w:rFonts w:ascii="Times New Roman" w:eastAsia="Times New Roman" w:hAnsi="Times New Roman" w:cs="Times New Roman"/>
+                <w:sz w:val="24"/>
+                <w:szCs w:val="24"/>
+                <w:lang w:eastAsia="en-GB"/>
+              </w:rPr>
+            </w:pPr>
+            <w:proofErr w:type="spellStart"/>
+            <w:r>
+              <w:rPr>
+                <w:rFonts w:ascii="Courier New" w:eastAsia="Times New Roman" w:hAnsi="Courier New" w:cs="Courier New"/>
+                <w:sz w:val="20"/>
+                <w:szCs w:val="20"/>
+                <w:lang w:eastAsia="en-GB"/>
+              </w:rPr>
+              <w:t>IsHTTPS</w:t>
+            </w:r>
+            <w:proofErr w:type="spellEnd"/>
+          </w:p>
+        </w:tc>
+        <w:tc>
+          <w:tcPr>
+            <w:tcW w:w="0" w:type="auto"/>
+            <w:vAlign w:val="center"/>
+            <w:hideMark/>
+          </w:tcPr>
+          <w:p>
+            <w:pPr>
+              <w:spacing w:after="0" w:line="240" w:lineRule="auto"/>
+              <w:jc w:val="right"/>
+              <w:rPr>
+                <w:rFonts w:ascii="Times New Roman" w:eastAsia="Times New Roman" w:hAnsi="Times New Roman" w:cs="Times New Roman"/>
+                <w:sz w:val="24"/>
+                <w:szCs w:val="24"/>
+                <w:lang w:eastAsia="en-GB"/>
+              </w:rPr>
+            </w:pPr>
+            <w:r>
+              <w:rPr>
+                <w:rFonts w:ascii="Times New Roman" w:eastAsia="Times New Roman" w:hAnsi="Times New Roman" w:cs="Times New Roman"/>
+                <w:b/>
+                <w:bCs/>
+                <w:sz w:val="24"/>
+                <w:szCs w:val="24"/>
+                <w:lang w:eastAsia="en-GB"/>
+              </w:rPr>
+              <w:t>+0.61</w:t>
+            </w:r>
+          </w:p>
+        </w:tc>
+        <w:tc>
+          <w:tcPr>
+            <w:tcW w:w="0" w:type="auto"/>
+            <w:vAlign w:val="center"/>
+            <w:hideMark/>
+          </w:tcPr>
+          <w:p>
+            <w:pPr>
+              <w:spacing w:after="0" w:line="240" w:lineRule="auto"/>
+              <w:rPr>
+                <w:rFonts w:ascii="Times New Roman" w:eastAsia="Times New Roman" w:hAnsi="Times New Roman" w:cs="Times New Roman"/>
+                <w:sz w:val="24"/>
+                <w:szCs w:val="24"/>
+                <w:lang w:eastAsia="en-GB"/>
+              </w:rPr>
+            </w:pPr>
+            <w:r>
+              <w:rPr>
+                <w:rFonts w:ascii="Times New Roman" w:eastAsia="Times New Roman" w:hAnsi="Times New Roman" w:cs="Times New Roman"/>
+                <w:sz w:val="24"/>
+                <w:szCs w:val="24"/>
+                <w:lang w:eastAsia="en-GB"/>
+              </w:rPr>
+              <w:t>Strong</w:t>
+            </w:r>
+          </w:p>
+        </w:tc>
+      </w:tr>
+      <w:tr>
+        <w:trPr>
+          <w:tblCellSpacing w:w="15" w:type="dxa"/>
+        </w:trPr>
+        <w:tc>
+          <w:tcPr>
+            <w:tcW w:w="0" w:type="auto"/>
+            <w:vAlign w:val="center"/>
+            <w:hideMark/>
+          </w:tcPr>
+          <w:p>
+            <w:pPr>
+              <w:spacing w:after="0" w:line="240" w:lineRule="auto"/>
+              <w:rPr>
+                <w:rFonts w:ascii="Times New Roman" w:eastAsia="Times New Roman" w:hAnsi="Times New Roman" w:cs="Times New Roman"/>
+                <w:sz w:val="24"/>
+                <w:szCs w:val="24"/>
+                <w:lang w:eastAsia="en-GB"/>
+              </w:rPr>
+            </w:pPr>
+            <w:proofErr w:type="spellStart"/>
+            <w:r>
+              <w:rPr>
+                <w:rFonts w:ascii="Courier New" w:eastAsia="Times New Roman" w:hAnsi="Courier New" w:cs="Courier New"/>
+                <w:sz w:val="20"/>
+                <w:szCs w:val="20"/>
+                <w:lang w:eastAsia="en-GB"/>
+              </w:rPr>
+              <w:t>DomainTitleMatchScore</w:t>
+            </w:r>
+            <w:proofErr w:type="spellEnd"/>
+          </w:p>
+        </w:tc>
+        <w:tc>
+          <w:tcPr>
+            <w:tcW w:w="0" w:type="auto"/>
+            <w:vAlign w:val="center"/>
+            <w:hideMark/>
+          </w:tcPr>
+          <w:p>
+            <w:pPr>
+              <w:spacing w:after="0" w:line="240" w:lineRule="auto"/>
+              <w:jc w:val="right"/>
+              <w:rPr>
+                <w:rFonts w:ascii="Times New Roman" w:eastAsia="Times New Roman" w:hAnsi="Times New Roman" w:cs="Times New Roman"/>
+                <w:sz w:val="24"/>
+                <w:szCs w:val="24"/>
+                <w:lang w:eastAsia="en-GB"/>
+              </w:rPr>
+            </w:pPr>
+            <w:r>
+              <w:rPr>
+                <w:rFonts w:ascii="Times New Roman" w:eastAsia="Times New Roman" w:hAnsi="Times New Roman" w:cs="Times New Roman"/>
+                <w:b/>
+                <w:bCs/>
+                <w:sz w:val="24"/>
+                <w:szCs w:val="24"/>
+                <w:lang w:eastAsia="en-GB"/>
+              </w:rPr>
+              <w:t>+0.58</w:t>
+            </w:r>
+          </w:p>
+        </w:tc>
+        <w:tc>
+          <w:tcPr>
+            <w:tcW w:w="0" w:type="auto"/>
+            <w:vAlign w:val="center"/>
+            <w:hideMark/>
+          </w:tcPr>
+          <w:p>
+            <w:pPr>
+              <w:spacing w:after="0" w:line="240" w:lineRule="auto"/>
+              <w:rPr>
+                <w:rFonts w:ascii="Times New Roman" w:eastAsia="Times New Roman" w:hAnsi="Times New Roman" w:cs="Times New Roman"/>
+                <w:sz w:val="24"/>
+                <w:szCs w:val="24"/>
+                <w:lang w:eastAsia="en-GB"/>
+              </w:rPr>
+            </w:pPr>
+            <w:r>
+              <w:rPr>
+                <w:rFonts w:ascii="Times New Roman" w:eastAsia="Times New Roman" w:hAnsi="Times New Roman" w:cs="Times New Roman"/>
+                <w:sz w:val="24"/>
+                <w:szCs w:val="24"/>
+                <w:lang w:eastAsia="en-GB"/>
+              </w:rPr>
+              <w:t>Moderate-strong</w:t>
+            </w:r>
+          </w:p>
+        </w:tc>
+      </w:tr>
+      <w:tr>
+        <w:trPr>
+          <w:tblCellSpacing w:w="15" w:type="dxa"/>
+        </w:trPr>
+        <w:tc>
+          <w:tcPr>
+            <w:tcW w:w="0" w:type="auto"/>
+            <w:vAlign w:val="center"/>
+            <w:hideMark/>
+          </w:tcPr>
+          <w:p>
+            <w:pPr>
+              <w:spacing w:after="0" w:line="240" w:lineRule="auto"/>
+              <w:rPr>
+                <w:rFonts w:ascii="Times New Roman" w:eastAsia="Times New Roman" w:hAnsi="Times New Roman" w:cs="Times New Roman"/>
+                <w:sz w:val="24"/>
+                <w:szCs w:val="24"/>
+                <w:lang w:eastAsia="en-GB"/>
+              </w:rPr>
+            </w:pPr>
+            <w:proofErr w:type="spellStart"/>
+            <w:r>
+              <w:rPr>
+                <w:rFonts w:ascii="Courier New" w:eastAsia="Times New Roman" w:hAnsi="Courier New" w:cs="Courier New"/>
+                <w:sz w:val="20"/>
+                <w:szCs w:val="20"/>
+                <w:lang w:eastAsia="en-GB"/>
+              </w:rPr>
+              <w:t>HasSubmitButton</w:t>
+            </w:r>
+            <w:proofErr w:type="spellEnd"/>
+          </w:p>
+        </w:tc>
+        <w:tc>
+          <w:tcPr>
+            <w:tcW w:w="0" w:type="auto"/>
+            <w:vAlign w:val="center"/>
+            <w:hideMark/>
+          </w:tcPr>
+          <w:p>
+            <w:pPr>
+              <w:spacing w:after="0" w:line="240" w:lineRule="auto"/>
+              <w:jc w:val="right"/>
+              <w:rPr>
+                <w:rFonts w:ascii="Times New Roman" w:eastAsia="Times New Roman" w:hAnsi="Times New Roman" w:cs="Times New Roman"/>
+                <w:sz w:val="24"/>
+                <w:szCs w:val="24"/>
+                <w:lang w:eastAsia="en-GB"/>
+              </w:rPr>
+            </w:pPr>
+            <w:r>
+              <w:rPr>
+                <w:rFonts w:ascii="Times New Roman" w:eastAsia="Times New Roman" w:hAnsi="Times New Roman" w:cs="Times New Roman"/>
+                <w:b/>
+                <w:bCs/>
+                <w:sz w:val="24"/>
+                <w:szCs w:val="24"/>
+                <w:lang w:eastAsia="en-GB"/>
+              </w:rPr>
+              <w:t>+0.58</w:t>
+            </w:r>
+          </w:p>
+        </w:tc>
+        <w:tc>
+          <w:tcPr>
+            <w:tcW w:w="0" w:type="auto"/>
+            <w:vAlign w:val="center"/>
+            <w:hideMark/>
+          </w:tcPr>
+          <w:p>
+            <w:pPr>
+              <w:spacing w:after="0" w:line="240" w:lineRule="auto"/>
+              <w:rPr>
+                <w:rFonts w:ascii="Times New Roman" w:eastAsia="Times New Roman" w:hAnsi="Times New Roman" w:cs="Times New Roman"/>
+                <w:sz w:val="24"/>
+                <w:szCs w:val="24"/>
+                <w:lang w:eastAsia="en-GB"/>
+              </w:rPr>
+            </w:pPr>
+            <w:r>
+              <w:rPr>
+                <w:rFonts w:ascii="Times New Roman" w:eastAsia="Times New Roman" w:hAnsi="Times New Roman" w:cs="Times New Roman"/>
+                <w:sz w:val="24"/>
+                <w:szCs w:val="24"/>
+                <w:lang w:eastAsia="en-GB"/>
+              </w:rPr>
+              <w:t>Moderate-strong</w:t>
+            </w:r>
+          </w:p>
+        </w:tc>
+      </w:tr>
+      <w:tr>
+        <w:trPr>
+          <w:tblCellSpacing w:w="15" w:type="dxa"/>
+        </w:trPr>
+        <w:tc>
+          <w:tcPr>
+            <w:tcW w:w="0" w:type="auto"/>
+            <w:vAlign w:val="center"/>
+            <w:hideMark/>
+          </w:tcPr>
+          <w:p>
+            <w:pPr>
+              <w:spacing w:after="0" w:line="240" w:lineRule="auto"/>
+              <w:rPr>
+                <w:rFonts w:ascii="Times New Roman" w:eastAsia="Times New Roman" w:hAnsi="Times New Roman" w:cs="Times New Roman"/>
+                <w:sz w:val="24"/>
+                <w:szCs w:val="24"/>
+                <w:lang w:eastAsia="en-GB"/>
+              </w:rPr>
+            </w:pPr>
+            <w:proofErr w:type="spellStart"/>
+            <w:r>
+              <w:rPr>
+                <w:rFonts w:ascii="Courier New" w:eastAsia="Times New Roman" w:hAnsi="Courier New" w:cs="Courier New"/>
+                <w:sz w:val="20"/>
+                <w:szCs w:val="20"/>
+                <w:lang w:eastAsia="en-GB"/>
+              </w:rPr>
+              <w:t>IsResponsive</w:t>
+            </w:r>
+            <w:proofErr w:type="spellEnd"/>
+          </w:p>
+        </w:tc>
+        <w:tc>
+          <w:tcPr>
+            <w:tcW w:w="0" w:type="auto"/>
+            <w:vAlign w:val="center"/>
+            <w:hideMark/>
+          </w:tcPr>
+          <w:p>
+            <w:pPr>
+              <w:spacing w:after="0" w:line="240" w:lineRule="auto"/>
+              <w:jc w:val="right"/>
+              <w:rPr>
+                <w:rFonts w:ascii="Times New Roman" w:eastAsia="Times New Roman" w:hAnsi="Times New Roman" w:cs="Times New Roman"/>
+                <w:sz w:val="24"/>
+                <w:szCs w:val="24"/>
+                <w:lang w:eastAsia="en-GB"/>
+              </w:rPr>
+            </w:pPr>
+            <w:r>
+              <w:rPr>
+                <w:rFonts w:ascii="Times New Roman" w:eastAsia="Times New Roman" w:hAnsi="Times New Roman" w:cs="Times New Roman"/>
+                <w:b/>
+                <w:bCs/>
+                <w:sz w:val="24"/>
+                <w:szCs w:val="24"/>
+                <w:lang w:eastAsia="en-GB"/>
+              </w:rPr>
+              <w:t>+0.55</w:t>
+            </w:r>
+          </w:p>
+        </w:tc>
+        <w:tc>
+          <w:tcPr>
+            <w:tcW w:w="0" w:type="auto"/>
+            <w:vAlign w:val="center"/>
+            <w:hideMark/>
+          </w:tcPr>
+          <w:p>
+            <w:pPr>
+              <w:spacing w:after="0" w:line="240" w:lineRule="auto"/>
+              <w:rPr>
+                <w:rFonts w:ascii="Times New Roman" w:eastAsia="Times New Roman" w:hAnsi="Times New Roman" w:cs="Times New Roman"/>
+                <w:sz w:val="24"/>
+                <w:szCs w:val="24"/>
+                <w:lang w:eastAsia="en-GB"/>
+              </w:rPr>
+            </w:pPr>
+            <w:r>
+              <w:rPr>
+                <w:rFonts w:ascii="Times New Roman" w:eastAsia="Times New Roman" w:hAnsi="Times New Roman" w:cs="Times New Roman"/>
+                <w:sz w:val="24"/>
+                <w:szCs w:val="24"/>
+                <w:lang w:eastAsia="en-GB"/>
+              </w:rPr>
+              <w:t>Moderate-strong</w:t>
+            </w:r>
+          </w:p>
+        </w:tc>
+      </w:tr>
+      <w:tr>
+        <w:trPr>
+          <w:tblCellSpacing w:w="15" w:type="dxa"/>
+        </w:trPr>
+        <w:tc>
+          <w:tcPr>
+            <w:tcW w:w="0" w:type="auto"/>
+            <w:vAlign w:val="center"/>
+            <w:hideMark/>
+          </w:tcPr>
+          <w:p>
+            <w:pPr>
+              <w:spacing w:after="0" w:line="240" w:lineRule="auto"/>
+              <w:rPr>
+                <w:rFonts w:ascii="Times New Roman" w:eastAsia="Times New Roman" w:hAnsi="Times New Roman" w:cs="Times New Roman"/>
+                <w:sz w:val="24"/>
+                <w:szCs w:val="24"/>
+                <w:lang w:eastAsia="en-GB"/>
+              </w:rPr>
+            </w:pPr>
+            <w:proofErr w:type="spellStart"/>
+            <w:r>
+              <w:rPr>
+                <w:rFonts w:ascii="Courier New" w:eastAsia="Times New Roman" w:hAnsi="Courier New" w:cs="Courier New"/>
+                <w:sz w:val="20"/>
+                <w:szCs w:val="20"/>
+                <w:lang w:eastAsia="en-GB"/>
+              </w:rPr>
+              <w:t>URLTitleMatchScore</w:t>
+            </w:r>
+            <w:proofErr w:type="spellEnd"/>
+          </w:p>
+        </w:tc>
+        <w:tc>
+          <w:tcPr>
+            <w:tcW w:w="0" w:type="auto"/>
+            <w:vAlign w:val="center"/>
+            <w:hideMark/>
+          </w:tcPr>
+          <w:p>
+            <w:pPr>
+              <w:spacing w:after="0" w:line="240" w:lineRule="auto"/>
+              <w:jc w:val="right"/>
+              <w:rPr>
+                <w:rFonts w:ascii="Times New Roman" w:eastAsia="Times New Roman" w:hAnsi="Times New Roman" w:cs="Times New Roman"/>
+                <w:sz w:val="24"/>
+                <w:szCs w:val="24"/>
+                <w:lang w:eastAsia="en-GB"/>
+              </w:rPr>
+            </w:pPr>
+            <w:r>
+              <w:rPr>
+                <w:rFonts w:ascii="Times New Roman" w:eastAsia="Times New Roman" w:hAnsi="Times New Roman" w:cs="Times New Roman"/>
+                <w:b/>
+                <w:bCs/>
+                <w:sz w:val="24"/>
+                <w:szCs w:val="24"/>
+                <w:lang w:eastAsia="en-GB"/>
+              </w:rPr>
+              <w:t>+0.54</w:t>
+            </w:r>
+          </w:p>
+        </w:tc>
+        <w:tc>
+          <w:tcPr>
+            <w:tcW w:w="0" w:type="auto"/>
+            <w:vAlign w:val="center"/>
+            <w:hideMark/>
+          </w:tcPr>
+          <w:p>
+            <w:pPr>
+              <w:spacing w:after="0" w:line="240" w:lineRule="auto"/>
+              <w:rPr>
+                <w:rFonts w:ascii="Times New Roman" w:eastAsia="Times New Roman" w:hAnsi="Times New Roman" w:cs="Times New Roman"/>
+                <w:sz w:val="24"/>
+                <w:szCs w:val="24"/>
+                <w:lang w:eastAsia="en-GB"/>
+              </w:rPr>
+            </w:pPr>
+            <w:r>
+              <w:rPr>
+                <w:rFonts w:ascii="Times New Roman" w:eastAsia="Times New Roman" w:hAnsi="Times New Roman" w:cs="Times New Roman"/>
+                <w:sz w:val="24"/>
+                <w:szCs w:val="24"/>
+                <w:lang w:eastAsia="en-GB"/>
+              </w:rPr>
+              <w:t>Moderate-strong</w:t>
+            </w:r>
+          </w:p>
+        </w:tc>
+      </w:tr>
+      <w:tr>
+        <w:trPr>
+          <w:tblCellSpacing w:w="15" w:type="dxa"/>
+        </w:trPr>
+        <w:tc>
+          <w:tcPr>
+            <w:tcW w:w="0" w:type="auto"/>
+            <w:vAlign w:val="center"/>
+            <w:hideMark/>
+          </w:tcPr>
+          <w:p>
+            <w:pPr>
+              <w:spacing w:after="0" w:line="240" w:lineRule="auto"/>
+              <w:rPr>
+                <w:rFonts w:ascii="Times New Roman" w:eastAsia="Times New Roman" w:hAnsi="Times New Roman" w:cs="Times New Roman"/>
+                <w:sz w:val="24"/>
+                <w:szCs w:val="24"/>
+                <w:lang w:eastAsia="en-GB"/>
+              </w:rPr>
+            </w:pPr>
+            <w:proofErr w:type="spellStart"/>
+            <w:r>
+              <w:rPr>
+                <w:rFonts w:ascii="Courier New" w:eastAsia="Times New Roman" w:hAnsi="Courier New" w:cs="Courier New"/>
+                <w:sz w:val="20"/>
+                <w:szCs w:val="20"/>
+                <w:lang w:eastAsia="en-GB"/>
+              </w:rPr>
+              <w:t>SpacialCharRatioInURL</w:t>
+            </w:r>
+            <w:proofErr w:type="spellEnd"/>
+          </w:p>
+        </w:tc>
+        <w:tc>
+          <w:tcPr>
+            <w:tcW w:w="0" w:type="auto"/>
+            <w:vAlign w:val="center"/>
+            <w:hideMark/>
+          </w:tcPr>
+          <w:p>
+            <w:pPr>
+              <w:spacing w:after="0" w:line="240" w:lineRule="auto"/>
+              <w:jc w:val="right"/>
+              <w:rPr>
+                <w:rFonts w:ascii="Times New Roman" w:eastAsia="Times New Roman" w:hAnsi="Times New Roman" w:cs="Times New Roman"/>
+                <w:sz w:val="24"/>
+                <w:szCs w:val="24"/>
+                <w:lang w:eastAsia="en-GB"/>
+              </w:rPr>
+            </w:pPr>
+            <w:r>
+              <w:rPr>
+                <w:rFonts w:ascii="Times New Roman" w:eastAsia="Times New Roman" w:hAnsi="Times New Roman" w:cs="Times New Roman"/>
+                <w:b/>
+                <w:bCs/>
+                <w:sz w:val="24"/>
+                <w:szCs w:val="24"/>
+                <w:lang w:eastAsia="en-GB"/>
+              </w:rPr>
+              <w:t>-0.53</w:t>
+            </w:r>
+          </w:p>
+        </w:tc>
+        <w:tc>
+          <w:tcPr>
+            <w:tcW w:w="0" w:type="auto"/>
+            <w:vAlign w:val="center"/>
+            <w:hideMark/>
+          </w:tcPr>
+          <w:p>
+            <w:pPr>
+              <w:spacing w:after="0" w:line="240" w:lineRule="auto"/>
+              <w:rPr>
+                <w:rFonts w:ascii="Times New Roman" w:eastAsia="Times New Roman" w:hAnsi="Times New Roman" w:cs="Times New Roman"/>
+                <w:sz w:val="24"/>
+                <w:szCs w:val="24"/>
+                <w:lang w:eastAsia="en-GB"/>
+              </w:rPr>
+            </w:pPr>
+            <w:r>
+              <w:rPr>
+                <w:rFonts w:ascii="Times New Roman" w:eastAsia="Times New Roman" w:hAnsi="Times New Roman" w:cs="Times New Roman"/>
+                <w:sz w:val="24"/>
+                <w:szCs w:val="24"/>
+                <w:lang w:eastAsia="en-GB"/>
+              </w:rPr>
+              <w:t>Moderate-strong</w:t>
+            </w:r>
+          </w:p>
+        </w:tc>
+      </w:tr>
+      <w:tr>
+        <w:trPr>
+          <w:tblCellSpacing w:w="15" w:type="dxa"/>
+        </w:trPr>
+        <w:tc>
+          <w:tcPr>
+            <w:tcW w:w="0" w:type="auto"/>
+            <w:vAlign w:val="center"/>
+            <w:hideMark/>
+          </w:tcPr>
+          <w:p>
+            <w:pPr>
+              <w:spacing w:after="0" w:line="240" w:lineRule="auto"/>
+              <w:rPr>
+                <w:rFonts w:ascii="Times New Roman" w:eastAsia="Times New Roman" w:hAnsi="Times New Roman" w:cs="Times New Roman"/>
+                <w:sz w:val="24"/>
+                <w:szCs w:val="24"/>
+                <w:lang w:eastAsia="en-GB"/>
+              </w:rPr>
+            </w:pPr>
+            <w:proofErr w:type="spellStart"/>
+            <w:r>
+              <w:rPr>
+                <w:rFonts w:ascii="Courier New" w:eastAsia="Times New Roman" w:hAnsi="Courier New" w:cs="Courier New"/>
+                <w:sz w:val="20"/>
+                <w:szCs w:val="20"/>
+                <w:lang w:eastAsia="en-GB"/>
+              </w:rPr>
+              <w:t>URLLength</w:t>
+            </w:r>
+            <w:proofErr w:type="spellEnd"/>
+          </w:p>
+        </w:tc>
+        <w:tc>
+          <w:tcPr>
+            <w:tcW w:w="0" w:type="auto"/>
+            <w:vAlign w:val="center"/>
+            <w:hideMark/>
+          </w:tcPr>
+          <w:p>
+            <w:pPr>
+              <w:spacing w:after="0" w:line="240" w:lineRule="auto"/>
+              <w:jc w:val="right"/>
+              <w:rPr>
+                <w:rFonts w:ascii="Times New Roman" w:eastAsia="Times New Roman" w:hAnsi="Times New Roman" w:cs="Times New Roman"/>
+                <w:sz w:val="24"/>
+                <w:szCs w:val="24"/>
+                <w:lang w:eastAsia="en-GB"/>
+              </w:rPr>
+            </w:pPr>
+            <w:r>
+              <w:rPr>
+                <w:rFonts w:ascii="Times New Roman" w:eastAsia="Times New Roman" w:hAnsi="Times New Roman" w:cs="Times New Roman"/>
+                <w:b/>
+                <w:bCs/>
+                <w:sz w:val="24"/>
+                <w:szCs w:val="24"/>
+                <w:lang w:eastAsia="en-GB"/>
+              </w:rPr>
+              <w:t>-0.23</w:t>
+            </w:r>
+          </w:p>
+        </w:tc>
+        <w:tc>
+          <w:tcPr>
+            <w:tcW w:w="0" w:type="auto"/>
+            <w:vAlign w:val="center"/>
+            <w:hideMark/>
+          </w:tcPr>
+          <w:p>
+            <w:pPr>
+              <w:spacing w:after="0" w:line="240" w:lineRule="auto"/>
+              <w:rPr>
+                <w:rFonts w:ascii="Times New Roman" w:eastAsia="Times New Roman" w:hAnsi="Times New Roman" w:cs="Times New Roman"/>
+                <w:sz w:val="24"/>
+                <w:szCs w:val="24"/>
+                <w:lang w:eastAsia="en-GB"/>
+              </w:rPr>
+            </w:pPr>
+            <w:r>
+              <w:rPr>
+                <w:rFonts w:ascii="Times New Roman" w:eastAsia="Times New Roman" w:hAnsi="Times New Roman" w:cs="Times New Roman"/>
+                <w:sz w:val="24"/>
+                <w:szCs w:val="24"/>
+                <w:lang w:eastAsia="en-GB"/>
+              </w:rPr>
+              <w:t>Moderate</w:t>
+            </w:r>
+          </w:p>
+        </w:tc>
+      </w:tr>
+    </w:tbl>
+    <w:p>
+      <w:r>
+        <w:t>"I investigated unusually high model performance, identified highly class-separating features, performed leakage/separability analysis, and compared models with and without potentially target-proxy features."</w:t>
+      </w:r>
       <w:bookmarkStart w:id="0" w:name="_GoBack"/>
       <w:bookmarkEnd w:id="0"/>
     </w:p>

</xml_diff>